<commit_message>
Release prep: cut 1.2.1
</commit_message>
<xml_diff>
--- a/WP-Security-Style-Guide.docx
+++ b/WP-Security-Style-Guide.docx
@@ -60,7 +60,7 @@
         </w:p>
       </w:sdtContent>
     </w:sdt>
-    <w:bookmarkStart w:id="20" w:name="X36581bebeabca3416158536cdfb70d32280bdb0"/>
+    <w:bookmarkStart w:id="40" w:name="X36581bebeabca3416158536cdfb70d32280bdb0"/>
     <w:p>
       <w:pPr>
         <w:pStyle w:val="Heading2"/>
@@ -157,8 +157,8 @@
         <w:t xml:space="preserve">Effective security communication must go beyond awareness to foster behavioral change. We prioritize resilience—the ability to recover quickly from inevitable breaches—as much as prevention. Our goal is to make security practices habitual and deeply embedded in our organizational culture.</w:t>
       </w:r>
     </w:p>
-    <w:bookmarkEnd w:id="20"/>
-    <w:bookmarkStart w:id="21" w:name="invulnerability-dilemma-and-opportunity"/>
+    <w:bookmarkEnd w:id="40"/>
+    <w:bookmarkStart w:id="41" w:name="invulnerability-dilemma-and-opportunity"/>
     <w:p>
       <w:pPr>
         <w:pStyle w:val="Heading2"/>
@@ -215,8 +215,8 @@
         <w:t xml:space="preserve">Maximizing security — and trust — in open source requires exposing all our work (warts and all) to everyone for review (or exploitation) by anyone.</w:t>
       </w:r>
     </w:p>
-    <w:bookmarkEnd w:id="21"/>
-    <w:bookmarkStart w:id="29" w:name="X5418bea311ee78f0b13c4ebe983ce94ac3fa145"/>
+    <w:bookmarkEnd w:id="41"/>
+    <w:bookmarkStart w:id="49" w:name="X5418bea311ee78f0b13c4ebe983ce94ac3fa145"/>
     <w:p>
       <w:pPr>
         <w:pStyle w:val="Heading2"/>
@@ -225,7 +225,7 @@
         <w:t xml:space="preserve">3. Writing about Security and Vulnerabilities in WordPress</w:t>
       </w:r>
     </w:p>
-    <w:bookmarkStart w:id="22" w:name="lead-with-solutions-not-fear"/>
+    <w:bookmarkStart w:id="42" w:name="lead-with-solutions-not-fear"/>
     <w:p>
       <w:pPr>
         <w:pStyle w:val="Heading3"/>
@@ -268,8 +268,8 @@
         <w:t xml:space="preserve">When describing threats, always provide an actionable path forward. What knowledge, tools, or relationships will most effectively reduce the risk? Lead with that. When writing about incidents or breaches, extract the lesson and present it constructively. There is almost always an upside in what can be learned and improved.</w:t>
       </w:r>
     </w:p>
-    <w:bookmarkEnd w:id="22"/>
-    <w:bookmarkStart w:id="23" w:name="be-realistic-and-proportionate"/>
+    <w:bookmarkEnd w:id="42"/>
+    <w:bookmarkStart w:id="43" w:name="be-realistic-and-proportionate"/>
     <w:p>
       <w:pPr>
         <w:pStyle w:val="Heading3"/>
@@ -294,8 +294,8 @@
         <w:t xml:space="preserve">Remember that the vast majority of WordPress compromises trace back to a few recurring causes: weak or reused passwords, outdated plugins with known vulnerabilities, and neglected server environments. This is not new information for security professionals, but it is new for many WordPress users. Repeat these messages clearly and without condescension.</w:t>
       </w:r>
     </w:p>
-    <w:bookmarkEnd w:id="23"/>
-    <w:bookmarkStart w:id="24" w:name="Xcfc099f7104098fd5edafb3ab996e22e6d33712"/>
+    <w:bookmarkEnd w:id="43"/>
+    <w:bookmarkStart w:id="44" w:name="Xcfc099f7104098fd5edafb3ab996e22e6d33712"/>
     <w:p>
       <w:pPr>
         <w:pStyle w:val="Heading3"/>
@@ -407,8 +407,8 @@
         </w:tc>
       </w:tr>
     </w:tbl>
-    <w:bookmarkEnd w:id="24"/>
-    <w:bookmarkStart w:id="25" w:name="make-security-accessible-and-engaging"/>
+    <w:bookmarkEnd w:id="44"/>
+    <w:bookmarkStart w:id="45" w:name="make-security-accessible-and-engaging"/>
     <w:p>
       <w:pPr>
         <w:pStyle w:val="Heading3"/>
@@ -425,8 +425,8 @@
         <w:t xml:space="preserve">Write for the WordPress user who is still learning. Security topics can be dry, intimidating, or both. Work to make them interesting, practical, and empowering. Use clear examples, relatable scenarios, and plain language. If a concept requires technical depth, build up to it. Always define terms on first use.</w:t>
       </w:r>
     </w:p>
-    <w:bookmarkEnd w:id="25"/>
-    <w:bookmarkStart w:id="26" w:name="X1ad13bd7d1d9c25b0406f901209771e97ba90a1"/>
+    <w:bookmarkEnd w:id="45"/>
+    <w:bookmarkStart w:id="46" w:name="X1ad13bd7d1d9c25b0406f901209771e97ba90a1"/>
     <w:p>
       <w:pPr>
         <w:pStyle w:val="Heading3"/>
@@ -808,8 +808,8 @@
         </w:tc>
       </w:tr>
     </w:tbl>
-    <w:bookmarkEnd w:id="26"/>
-    <w:bookmarkStart w:id="27" w:name="X21d2ade708a14b9d78b7e768b249a446b9f4b3f"/>
+    <w:bookmarkEnd w:id="46"/>
+    <w:bookmarkStart w:id="47" w:name="X21d2ade708a14b9d78b7e768b249a446b9f4b3f"/>
     <w:p>
       <w:pPr>
         <w:pStyle w:val="Heading3"/>
@@ -977,8 +977,8 @@
         <w:t xml:space="preserve">with its principles without formal certification. Use the correct term.</w:t>
       </w:r>
     </w:p>
-    <w:bookmarkEnd w:id="27"/>
-    <w:bookmarkStart w:id="28" w:name="Xb87176eaf66104c330f04b7e85a4df76333b7ad"/>
+    <w:bookmarkEnd w:id="47"/>
+    <w:bookmarkStart w:id="48" w:name="Xb87176eaf66104c330f04b7e85a4df76333b7ad"/>
     <w:p>
       <w:pPr>
         <w:pStyle w:val="Heading3"/>
@@ -1324,9 +1324,9 @@
         </w:tc>
       </w:tr>
     </w:tbl>
-    <w:bookmarkEnd w:id="28"/>
-    <w:bookmarkEnd w:id="29"/>
-    <w:bookmarkStart w:id="35" w:name="audience-voice-and-tone"/>
+    <w:bookmarkEnd w:id="48"/>
+    <w:bookmarkEnd w:id="49"/>
+    <w:bookmarkStart w:id="55" w:name="audience-voice-and-tone"/>
     <w:p>
       <w:pPr>
         <w:pStyle w:val="Heading2"/>
@@ -1335,7 +1335,7 @@
         <w:t xml:space="preserve">4. Audience, Voice, and Tone</w:t>
       </w:r>
     </w:p>
-    <w:bookmarkStart w:id="30" w:name="know-your-audiences"/>
+    <w:bookmarkStart w:id="50" w:name="know-your-audiences"/>
     <w:p>
       <w:pPr>
         <w:pStyle w:val="Heading3"/>
@@ -1423,8 +1423,8 @@
         <w:t xml:space="preserve">Anything you publish may be someone’s first introduction not only to WordPress security, but to WordPress as a project and community. Write to build trust, invite participation, and leave the reader better equipped than you found them.</w:t>
       </w:r>
     </w:p>
-    <w:bookmarkEnd w:id="30"/>
-    <w:bookmarkStart w:id="32" w:name="voice"/>
+    <w:bookmarkEnd w:id="50"/>
+    <w:bookmarkStart w:id="52" w:name="voice"/>
     <w:p>
       <w:pPr>
         <w:pStyle w:val="Heading3"/>
@@ -1443,7 +1443,7 @@
       <w:r>
         <w:t xml:space="preserve"> </w:t>
       </w:r>
-      <w:hyperlink r:id="rId31">
+      <w:hyperlink r:id="rId51">
         <w:r>
           <w:rPr>
             <w:rStyle w:val="Hyperlink"/>
@@ -1571,8 +1571,8 @@
         <w:t xml:space="preserve">— reflecting the open-source values of transparency, collaboration, and shared responsibility.</w:t>
       </w:r>
     </w:p>
-    <w:bookmarkEnd w:id="32"/>
-    <w:bookmarkStart w:id="33" w:name="tone"/>
+    <w:bookmarkEnd w:id="52"/>
+    <w:bookmarkStart w:id="53" w:name="tone"/>
     <w:p>
       <w:pPr>
         <w:pStyle w:val="Heading3"/>
@@ -1709,8 +1709,8 @@
         <w:t xml:space="preserve">Thought leadership: reflective, well-sourced, open to nuance and debate.</w:t>
       </w:r>
     </w:p>
-    <w:bookmarkEnd w:id="33"/>
-    <w:bookmarkStart w:id="34" w:name="wordpress-voice-baseline"/>
+    <w:bookmarkEnd w:id="53"/>
+    <w:bookmarkStart w:id="54" w:name="wordpress-voice-baseline"/>
     <w:p>
       <w:pPr>
         <w:pStyle w:val="Heading3"/>
@@ -1859,9 +1859,9 @@
         <w:t xml:space="preserve">— write as if this may be the reader’s first experience with WordPress and its community norms.</w:t>
       </w:r>
     </w:p>
-    <w:bookmarkEnd w:id="34"/>
-    <w:bookmarkEnd w:id="35"/>
-    <w:bookmarkStart w:id="40" w:name="inclusive-communication"/>
+    <w:bookmarkEnd w:id="54"/>
+    <w:bookmarkEnd w:id="55"/>
+    <w:bookmarkStart w:id="60" w:name="inclusive-communication"/>
     <w:p>
       <w:pPr>
         <w:pStyle w:val="Heading2"/>
@@ -1870,7 +1870,7 @@
         <w:t xml:space="preserve">5. Inclusive Communication</w:t>
       </w:r>
     </w:p>
-    <w:bookmarkStart w:id="36" w:name="bring-outsiders-in"/>
+    <w:bookmarkStart w:id="56" w:name="bring-outsiders-in"/>
     <w:p>
       <w:pPr>
         <w:pStyle w:val="Heading3"/>
@@ -1895,8 +1895,8 @@
         <w:t xml:space="preserve">Prefer shorter sentences over dense clause-stacking. Avoid sarcasm, insider banter, and idioms that may confuse international readers or make the writing feel exclusionary. Action-oriented language is usually better than blame-oriented language.</w:t>
       </w:r>
     </w:p>
-    <w:bookmarkEnd w:id="36"/>
-    <w:bookmarkStart w:id="37" w:name="language-choices"/>
+    <w:bookmarkEnd w:id="56"/>
+    <w:bookmarkStart w:id="57" w:name="language-choices"/>
     <w:p>
       <w:pPr>
         <w:pStyle w:val="Heading3"/>
@@ -2138,8 +2138,8 @@
         <w:t xml:space="preserve">which has positive connotations in many technical communities.</w:t>
       </w:r>
     </w:p>
-    <w:bookmarkEnd w:id="37"/>
-    <w:bookmarkStart w:id="38" w:name="wordpress-specific-terminology"/>
+    <w:bookmarkEnd w:id="57"/>
+    <w:bookmarkStart w:id="58" w:name="wordpress-specific-terminology"/>
     <w:p>
       <w:pPr>
         <w:pStyle w:val="Heading3"/>
@@ -2333,8 +2333,8 @@
         <w:t xml:space="preserve">— WordPress’s built-in mechanism for applying updates automatically. Hyphenated.</w:t>
       </w:r>
     </w:p>
-    <w:bookmarkEnd w:id="38"/>
-    <w:bookmarkStart w:id="39" w:name="before-you-publish"/>
+    <w:bookmarkEnd w:id="58"/>
+    <w:bookmarkStart w:id="59" w:name="before-you-publish"/>
     <w:p>
       <w:pPr>
         <w:pStyle w:val="Heading3"/>
@@ -2439,9 +2439,9 @@
         <w:t xml:space="preserve">when the audience includes regular contributors, maintainers, or communications staff?</w:t>
       </w:r>
     </w:p>
-    <w:bookmarkEnd w:id="39"/>
-    <w:bookmarkEnd w:id="40"/>
-    <w:bookmarkStart w:id="46" w:name="technical-formatting-guidelines"/>
+    <w:bookmarkEnd w:id="59"/>
+    <w:bookmarkEnd w:id="60"/>
+    <w:bookmarkStart w:id="66" w:name="technical-formatting-guidelines"/>
     <w:p>
       <w:pPr>
         <w:pStyle w:val="Heading2"/>
@@ -2450,7 +2450,7 @@
         <w:t xml:space="preserve">6. Technical Formatting Guidelines</w:t>
       </w:r>
     </w:p>
-    <w:bookmarkStart w:id="41" w:name="two-font-system"/>
+    <w:bookmarkStart w:id="61" w:name="two-font-system"/>
     <w:p>
       <w:pPr>
         <w:pStyle w:val="Heading3"/>
@@ -2545,8 +2545,8 @@
         <w:t xml:space="preserve">.</w:t>
       </w:r>
     </w:p>
-    <w:bookmarkEnd w:id="41"/>
-    <w:bookmarkStart w:id="42" w:name="when-to-use-monospace"/>
+    <w:bookmarkEnd w:id="61"/>
+    <w:bookmarkStart w:id="62" w:name="when-to-use-monospace"/>
     <w:p>
       <w:pPr>
         <w:pStyle w:val="Heading3"/>
@@ -2798,8 +2798,8 @@
         <w:t xml:space="preserve">).</w:t>
       </w:r>
     </w:p>
-    <w:bookmarkEnd w:id="42"/>
-    <w:bookmarkStart w:id="43" w:name="when-to-use-normal-font"/>
+    <w:bookmarkEnd w:id="62"/>
+    <w:bookmarkStart w:id="63" w:name="when-to-use-normal-font"/>
     <w:p>
       <w:pPr>
         <w:pStyle w:val="Heading3"/>
@@ -2852,8 +2852,8 @@
         <w:t xml:space="preserve">Error messages and security prompts when quoting them for a non-technical audience (use quotation marks).</w:t>
       </w:r>
     </w:p>
-    <w:bookmarkEnd w:id="43"/>
-    <w:bookmarkStart w:id="44" w:name="bold-and-emphasis"/>
+    <w:bookmarkEnd w:id="63"/>
+    <w:bookmarkStart w:id="64" w:name="bold-and-emphasis"/>
     <w:p>
       <w:pPr>
         <w:pStyle w:val="Heading3"/>
@@ -2870,8 +2870,8 @@
         <w:t xml:space="preserve">Use bold sparingly for key terms being defined, important warnings, and UI elements the reader needs to find and click. Use italics for emphasis, titles of publications, and introducing new terms in running text.</w:t>
       </w:r>
     </w:p>
-    <w:bookmarkEnd w:id="44"/>
-    <w:bookmarkStart w:id="45" w:name="acronyms"/>
+    <w:bookmarkEnd w:id="64"/>
+    <w:bookmarkStart w:id="65" w:name="acronyms"/>
     <w:p>
       <w:pPr>
         <w:pStyle w:val="Heading3"/>
@@ -2888,9 +2888,9 @@
         <w:t xml:space="preserve">Spell out acronyms on first use, followed by the abbreviation in parentheses: cross-site scripting (XSS), two-factor authentication (2FA). Use the acronym alone in subsequent references. If the acronym is more widely recognized than the full form (e.g., SQL, HTML, SSH), the spelled-out version can be omitted for technical audiences.</w:t>
       </w:r>
     </w:p>
-    <w:bookmarkEnd w:id="45"/>
-    <w:bookmarkEnd w:id="46"/>
-    <w:bookmarkStart w:id="56" w:name="writing-about-vulnerabilities"/>
+    <w:bookmarkEnd w:id="65"/>
+    <w:bookmarkEnd w:id="66"/>
+    <w:bookmarkStart w:id="76" w:name="writing-about-vulnerabilities"/>
     <w:p>
       <w:pPr>
         <w:pStyle w:val="Heading2"/>
@@ -2899,7 +2899,7 @@
         <w:t xml:space="preserve">7. Writing about Vulnerabilities</w:t>
       </w:r>
     </w:p>
-    <w:bookmarkStart w:id="47" w:name="disclosure-and-reporting"/>
+    <w:bookmarkStart w:id="67" w:name="disclosure-and-reporting"/>
     <w:p>
       <w:pPr>
         <w:pStyle w:val="Heading3"/>
@@ -3126,8 +3126,8 @@
         <w:t xml:space="preserve">or later to resolve this issue. [Credit to researcher/team for responsible disclosure.]</w:t>
       </w:r>
     </w:p>
-    <w:bookmarkEnd w:id="47"/>
-    <w:bookmarkStart w:id="49" w:name="severity-language"/>
+    <w:bookmarkEnd w:id="67"/>
+    <w:bookmarkStart w:id="69" w:name="severity-language"/>
     <w:p>
       <w:pPr>
         <w:pStyle w:val="Heading3"/>
@@ -3146,7 +3146,7 @@
       <w:r>
         <w:t xml:space="preserve"> </w:t>
       </w:r>
-      <w:hyperlink r:id="rId48">
+      <w:hyperlink r:id="rId68">
         <w:r>
           <w:rPr>
             <w:rStyle w:val="Hyperlink"/>
@@ -3577,8 +3577,8 @@
         <w:t xml:space="preserve">While these severity levels mean different things for our customers, all vulnerability communications should follow the same professional procedures.</w:t>
       </w:r>
     </w:p>
-    <w:bookmarkEnd w:id="49"/>
-    <w:bookmarkStart w:id="51" w:name="avoiding-sensationalism"/>
+    <w:bookmarkEnd w:id="69"/>
+    <w:bookmarkStart w:id="71" w:name="avoiding-sensationalism"/>
     <w:p>
       <w:pPr>
         <w:pStyle w:val="Heading3"/>
@@ -3745,7 +3745,7 @@
       <w:r>
         <w:t xml:space="preserve"> </w:t>
       </w:r>
-      <w:hyperlink r:id="rId50">
+      <w:hyperlink r:id="rId70">
         <w:r>
           <w:rPr>
             <w:rStyle w:val="Hyperlink"/>
@@ -3781,8 +3781,8 @@
         <w:t xml:space="preserve">) to help readers gauge real-world urgency beyond theoretical severity.</w:t>
       </w:r>
     </w:p>
-    <w:bookmarkEnd w:id="51"/>
-    <w:bookmarkStart w:id="52" w:name="X69a7983f63bcc4948a21d5a47945f9e0c13289a"/>
+    <w:bookmarkEnd w:id="71"/>
+    <w:bookmarkStart w:id="72" w:name="X69a7983f63bcc4948a21d5a47945f9e0c13289a"/>
     <w:p>
       <w:pPr>
         <w:pStyle w:val="Heading3"/>
@@ -3865,8 +3865,8 @@
         <w:t xml:space="preserve">follow a similar pattern to plugins but receive less public attention. Provide the same level of specificity—name the theme, the affected versions, and the fix.</w:t>
       </w:r>
     </w:p>
-    <w:bookmarkEnd w:id="52"/>
-    <w:bookmarkStart w:id="53" w:name="Xa93930522491a5775bc66f78a0f440e6e308200"/>
+    <w:bookmarkEnd w:id="72"/>
+    <w:bookmarkStart w:id="73" w:name="Xa93930522491a5775bc66f78a0f440e6e308200"/>
     <w:p>
       <w:pPr>
         <w:pStyle w:val="Heading3"/>
@@ -3919,8 +3919,8 @@
         <w:t xml:space="preserve">Never editorialize about a plugin author’s competence or responsiveness. Stick to what happened, what was fixed, and what users should do.</w:t>
       </w:r>
     </w:p>
-    <w:bookmarkEnd w:id="53"/>
-    <w:bookmarkStart w:id="54" w:name="operational-policy-boundary"/>
+    <w:bookmarkEnd w:id="73"/>
+    <w:bookmarkStart w:id="74" w:name="operational-policy-boundary"/>
     <w:p>
       <w:pPr>
         <w:pStyle w:val="Heading3"/>
@@ -3966,8 +3966,8 @@
         <w:t xml:space="preserve">during a vulnerability response are maintained separately in §9 (Operational Appendix). This separation ensures the style guidance remains stable even as internal workflows evolve.</w:t>
       </w:r>
     </w:p>
-    <w:bookmarkEnd w:id="54"/>
-    <w:bookmarkStart w:id="55" w:name="writing-about-supply-chain-incidents"/>
+    <w:bookmarkEnd w:id="74"/>
+    <w:bookmarkStart w:id="75" w:name="writing-about-supply-chain-incidents"/>
     <w:p>
       <w:pPr>
         <w:pStyle w:val="Heading3"/>
@@ -4101,9 +4101,9 @@
         <w:t xml:space="preserve">advice is insufficient for supply chain incidents. Specify whether the plugin should be updated, replaced, or removed entirely—and whether affected sites need a malware scan or password reset.</w:t>
       </w:r>
     </w:p>
-    <w:bookmarkEnd w:id="55"/>
-    <w:bookmarkEnd w:id="56"/>
-    <w:bookmarkStart w:id="59" w:name="glossary-of-wordpress-security-terms"/>
+    <w:bookmarkEnd w:id="75"/>
+    <w:bookmarkEnd w:id="76"/>
+    <w:bookmarkStart w:id="79" w:name="glossary-of-wordpress-security-terms"/>
     <w:p>
       <w:pPr>
         <w:pStyle w:val="Heading2"/>
@@ -4679,7 +4679,7 @@
       <w:r>
         <w:t xml:space="preserve"> </w:t>
       </w:r>
-      <w:hyperlink r:id="rId57">
+      <w:hyperlink r:id="rId77">
         <w:r>
           <w:rPr>
             <w:rStyle w:val="Hyperlink"/>
@@ -7377,7 +7377,7 @@
       <w:r>
         <w:t xml:space="preserve"> </w:t>
       </w:r>
-      <w:hyperlink r:id="rId58">
+      <w:hyperlink r:id="rId78">
         <w:r>
           <w:rPr>
             <w:rStyle w:val="Hyperlink"/>
@@ -9882,8 +9882,8 @@
         <w:t xml:space="preserve">— A security model that requires continuous verification of all users and devices, regardless of network location. No user or system is trusted by default. In WordPress, Zero Trust principles inform practices like requiring 2FA, enforcing session limits, and restricting admin access by IP or device.</w:t>
       </w:r>
     </w:p>
-    <w:bookmarkEnd w:id="59"/>
-    <w:bookmarkStart w:id="61" w:name="Xc98ca64413f1be501c67131a536664cca022800"/>
+    <w:bookmarkEnd w:id="79"/>
+    <w:bookmarkStart w:id="81" w:name="Xc98ca64413f1be501c67131a536664cca022800"/>
     <w:p>
       <w:pPr>
         <w:pStyle w:val="Heading2"/>
@@ -10054,7 +10054,7 @@
         <w:t xml:space="preserve">Any technical nuances or environmental factors.</w:t>
       </w:r>
     </w:p>
-    <w:bookmarkStart w:id="60" w:name="X731cb7f475e279d99df4e9ac9396315de09e358"/>
+    <w:bookmarkStart w:id="80" w:name="X731cb7f475e279d99df4e9ac9396315de09e358"/>
     <w:p>
       <w:pPr>
         <w:pStyle w:val="Heading3"/>
@@ -10173,9 +10173,9 @@
         <w:t xml:space="preserve">Marketing communicates via internal project management templates and established notification channels.</w:t>
       </w:r>
     </w:p>
-    <w:bookmarkEnd w:id="60"/>
-    <w:bookmarkEnd w:id="61"/>
-    <w:bookmarkStart w:id="74" w:name="references-and-further-reading"/>
+    <w:bookmarkEnd w:id="80"/>
+    <w:bookmarkEnd w:id="81"/>
+    <w:bookmarkStart w:id="94" w:name="references-and-further-reading"/>
     <w:p>
       <w:pPr>
         <w:pStyle w:val="Heading2"/>
@@ -10203,7 +10203,7 @@
           <w:numId w:val="1022"/>
         </w:numPr>
       </w:pPr>
-      <w:hyperlink r:id="rId31">
+      <w:hyperlink r:id="rId51">
         <w:r>
           <w:rPr>
             <w:rStyle w:val="Hyperlink"/>
@@ -10225,7 +10225,7 @@
           <w:numId w:val="1022"/>
         </w:numPr>
       </w:pPr>
-      <w:hyperlink r:id="rId62">
+      <w:hyperlink r:id="rId82">
         <w:r>
           <w:rPr>
             <w:rStyle w:val="Hyperlink"/>
@@ -10247,7 +10247,7 @@
           <w:numId w:val="1022"/>
         </w:numPr>
       </w:pPr>
-      <w:hyperlink r:id="rId63">
+      <w:hyperlink r:id="rId83">
         <w:r>
           <w:rPr>
             <w:rStyle w:val="Hyperlink"/>
@@ -10269,7 +10269,7 @@
           <w:numId w:val="1022"/>
         </w:numPr>
       </w:pPr>
-      <w:hyperlink r:id="rId64">
+      <w:hyperlink r:id="rId84">
         <w:r>
           <w:rPr>
             <w:rStyle w:val="Hyperlink"/>
@@ -10303,7 +10303,7 @@
           <w:numId w:val="1023"/>
         </w:numPr>
       </w:pPr>
-      <w:hyperlink r:id="rId65">
+      <w:hyperlink r:id="rId85">
         <w:r>
           <w:rPr>
             <w:rStyle w:val="Hyperlink"/>
@@ -10319,7 +10319,7 @@
           <w:numId w:val="1023"/>
         </w:numPr>
       </w:pPr>
-      <w:hyperlink r:id="rId66">
+      <w:hyperlink r:id="rId86">
         <w:r>
           <w:rPr>
             <w:rStyle w:val="Hyperlink"/>
@@ -10335,7 +10335,7 @@
           <w:numId w:val="1023"/>
         </w:numPr>
       </w:pPr>
-      <w:hyperlink r:id="rId67">
+      <w:hyperlink r:id="rId87">
         <w:r>
           <w:rPr>
             <w:rStyle w:val="Hyperlink"/>
@@ -10374,7 +10374,7 @@
           <w:numId w:val="1024"/>
         </w:numPr>
       </w:pPr>
-      <w:hyperlink r:id="rId68">
+      <w:hyperlink r:id="rId88">
         <w:r>
           <w:rPr>
             <w:rStyle w:val="Hyperlink"/>
@@ -10388,7 +10388,7 @@
       <w:r>
         <w:t xml:space="preserve">(</w:t>
       </w:r>
-      <w:hyperlink r:id="rId69">
+      <w:hyperlink r:id="rId89">
         <w:r>
           <w:rPr>
             <w:rStyle w:val="Hyperlink"/>
@@ -10407,7 +10407,7 @@
           <w:numId w:val="1024"/>
         </w:numPr>
       </w:pPr>
-      <w:hyperlink r:id="rId70">
+      <w:hyperlink r:id="rId90">
         <w:r>
           <w:rPr>
             <w:rStyle w:val="Hyperlink"/>
@@ -10423,7 +10423,7 @@
           <w:numId w:val="1024"/>
         </w:numPr>
       </w:pPr>
-      <w:hyperlink r:id="rId71">
+      <w:hyperlink r:id="rId91">
         <w:r>
           <w:rPr>
             <w:rStyle w:val="Hyperlink"/>
@@ -10439,7 +10439,7 @@
           <w:numId w:val="1024"/>
         </w:numPr>
       </w:pPr>
-      <w:hyperlink r:id="rId72">
+      <w:hyperlink r:id="rId92">
         <w:r>
           <w:rPr>
             <w:rStyle w:val="Hyperlink"/>
@@ -10461,7 +10461,7 @@
           <w:numId w:val="1024"/>
         </w:numPr>
       </w:pPr>
-      <w:hyperlink r:id="rId73">
+      <w:hyperlink r:id="rId93">
         <w:r>
           <w:rPr>
             <w:rStyle w:val="Hyperlink"/>
@@ -10476,8 +10476,8 @@
         <w:t xml:space="preserve">— now maintained by Automattic as part of the Jetpack ecosystem.</w:t>
       </w:r>
     </w:p>
-    <w:bookmarkEnd w:id="74"/>
-    <w:bookmarkStart w:id="78" w:name="related-documents"/>
+    <w:bookmarkEnd w:id="94"/>
+    <w:bookmarkStart w:id="98" w:name="related-documents"/>
     <w:p>
       <w:pPr>
         <w:pStyle w:val="Heading2"/>
@@ -10494,7 +10494,7 @@
           <w:numId w:val="1025"/>
         </w:numPr>
       </w:pPr>
-      <w:hyperlink r:id="rId75">
+      <w:hyperlink r:id="rId95">
         <w:r>
           <w:rPr>
             <w:rStyle w:val="Hyperlink"/>
@@ -10519,7 +10519,7 @@
           <w:numId w:val="1025"/>
         </w:numPr>
       </w:pPr>
-      <w:hyperlink r:id="rId76">
+      <w:hyperlink r:id="rId96">
         <w:r>
           <w:rPr>
             <w:rStyle w:val="Hyperlink"/>
@@ -10544,7 +10544,7 @@
           <w:numId w:val="1025"/>
         </w:numPr>
       </w:pPr>
-      <w:hyperlink r:id="rId77">
+      <w:hyperlink r:id="rId97">
         <w:r>
           <w:rPr>
             <w:rStyle w:val="Hyperlink"/>
@@ -10585,7 +10585,7 @@
       <w:r>
         <w:t xml:space="preserve"> </w:t>
       </w:r>
-      <w:hyperlink r:id="rId68">
+      <w:hyperlink r:id="rId88">
         <w:r>
           <w:rPr>
             <w:rStyle w:val="Hyperlink"/>
@@ -10599,7 +10599,7 @@
       <w:r>
         <w:t xml:space="preserve">(</w:t>
       </w:r>
-      <w:hyperlink r:id="rId69">
+      <w:hyperlink r:id="rId89">
         <w:r>
           <w:rPr>
             <w:rStyle w:val="Hyperlink"/>
@@ -10611,8 +10611,8 @@
         <w:t xml:space="preserve">).</w:t>
       </w:r>
     </w:p>
-    <w:bookmarkEnd w:id="78"/>
-    <w:bookmarkStart w:id="80" w:name="license-and-attribution"/>
+    <w:bookmarkEnd w:id="98"/>
+    <w:bookmarkStart w:id="100" w:name="license-and-attribution"/>
     <w:p>
       <w:pPr>
         <w:pStyle w:val="Heading2"/>
@@ -10631,7 +10631,7 @@
       <w:r>
         <w:t xml:space="preserve"> </w:t>
       </w:r>
-      <w:hyperlink r:id="rId79">
+      <w:hyperlink r:id="rId99">
         <w:r>
           <w:rPr>
             <w:rStyle w:val="Hyperlink"/>
@@ -10677,9 +10677,9 @@
         <w:t xml:space="preserve">(2023), used with attribution. AI threat data draws on the Verizon Data Breach Investigations Report (2025) and IBM’s Cost of a Data Breach Report (2025).</w:t>
       </w:r>
     </w:p>
-    <w:bookmarkEnd w:id="80"/>
+    <w:bookmarkEnd w:id="100"/>
     <w:sectPr>
-      <w:footerReference r:id="rId9" w:type="default"/>
+      <w:footerReference r:id="rId31" w:type="default"/>
       <w:footnotePr>
         <w:numRestart w:val="eachSect"/>
       </w:footnotePr>

</xml_diff>